<commit_message>
Agrega numeración de página y sangría francesa APA 7 al informe
El informe no tenía números de página (obligatorios en APA 7) y la
versión .docx no aplicaba sangría francesa en la lista de referencias
(el PDF sí la tenía). Se corrigen ambos formatos.

Co-Authored-By: Claude Sonnet 5 <noreply@anthropic.com>
Claude-Session: https://claude.ai/code/session_01BrPPEMYSwgdtGdQRGDTXri
</commit_message>
<xml_diff>
--- a/IA-Explicativa-Tortola/InformeIA-Limites_LauraMedina.docx
+++ b/IA-Explicativa-Tortola/InformeIA-Limites_LauraMedina.docx
@@ -833,108 +833,6 @@
         <w:drawing>
           <wp:inline distT="0" distB="0" distL="0" distR="0">
             <wp:extent cx="2857500" cy="2428875"/>
-            <wp:effectExtent t="0" r="0" b="0" l="0"/>
-            <wp:docPr id="1" name="" descr="" title=""/>
-            <wp:cNvGraphicFramePr>
-              <a:graphicFrameLocks xmlns:a="http://schemas.openxmlformats.org/drawingml/2006/main" noChangeAspect="1"/>
-            </wp:cNvGraphicFramePr>
-            <a:graphic xmlns:a="http://schemas.openxmlformats.org/drawingml/2006/main">
-              <a:graphicData uri="http://schemas.openxmlformats.org/drawingml/2006/picture">
-                <pic:pic xmlns:pic="http://schemas.openxmlformats.org/drawingml/2006/picture">
-                  <pic:nvPicPr>
-                    <pic:cNvPr id="0" name="" descr=""/>
-                    <pic:cNvPicPr>
-                      <a:picLocks noChangeAspect="1" noChangeArrowheads="1"/>
-                    </pic:cNvPicPr>
-                  </pic:nvPicPr>
-                  <pic:blipFill>
-                    <a:blip r:embed="rId7" cstate="none"/>
-                    <a:srcRect/>
-                    <a:stretch>
-                      <a:fillRect/>
-                    </a:stretch>
-                  </pic:blipFill>
-                  <pic:spPr bwMode="auto">
-                    <a:xfrm>
-                      <a:off x="0" y="0"/>
-                      <a:ext cx="2857500" cy="2428875"/>
-                    </a:xfrm>
-                    <a:prstGeom prst="rect">
-                      <a:avLst/>
-                    </a:prstGeom>
-                  </pic:spPr>
-                </pic:pic>
-              </a:graphicData>
-            </a:graphic>
-          </wp:inline>
-        </w:drawing>
-      </w:r>
-    </w:p>
-    <w:p>
-      <w:pPr>
-        <w:spacing w:after="200"/>
-        <w:jc w:val="center"/>
-      </w:pPr>
-      <w:r>
-        <w:rPr>
-          <w:rFonts w:ascii="Arial" w:cs="Arial" w:eastAsia="Arial" w:hAnsi="Arial"/>
-          <w:i/>
-          <w:iCs/>
-          <w:sz w:val="19"/>
-          <w:szCs w:val="19"/>
-        </w:rPr>
-        <w:t xml:space="preserve">Figura 1. Matriz de confusión en el conjunto de prueba.</w:t>
-      </w:r>
-    </w:p>
-    <w:p>
-      <w:pPr>
-        <w:pStyle w:val="Heading1"/>
-        <w:spacing w:after="120" w:before="200"/>
-      </w:pPr>
-      <w:r>
-        <w:rPr>
-          <w:rFonts w:ascii="Arial" w:cs="Arial" w:eastAsia="Arial" w:hAnsi="Arial"/>
-          <w:b/>
-          <w:bCs/>
-          <w:sz w:val="26"/>
-          <w:szCs w:val="26"/>
-        </w:rPr>
-        <w:t xml:space="preserve">Explicación del Modelo</w:t>
-      </w:r>
-    </w:p>
-    <w:p>
-      <w:pPr>
-        <w:spacing w:after="160"/>
-        <w:jc w:val="both"/>
-      </w:pPr>
-      <w:r>
-        <w:rPr>
-          <w:rFonts w:ascii="Arial" w:cs="Arial" w:eastAsia="Arial" w:hAnsi="Arial"/>
-          <w:b/>
-          <w:bCs/>
-          <w:sz w:val="22"/>
-          <w:szCs w:val="22"/>
-        </w:rPr>
-        <w:t xml:space="preserve">SHAP global. </w:t>
-      </w:r>
-      <w:r>
-        <w:rPr>
-          <w:rFonts w:ascii="Arial" w:cs="Arial" w:eastAsia="Arial" w:hAnsi="Arial"/>
-          <w:sz w:val="22"/>
-          <w:szCs w:val="22"/>
-        </w:rPr>
-        <w:t xml:space="preserve">SHAP intervencional (Lundberg y Lee, 2017) marginaliza sobre la distribución de cada variable, rompiendo correlaciones entre predictores. CONCEAL encabeza el ranking (media |SHAP| = 0.082), seguida de HEIGHT (0.051) y CEILING (0.035). La importancia por permutación coincide en las tres variables centrales; HEIGHT lidera en permutación porque correlaciona con varias variables del entorno (ver Diagnóstico de Proxies), lo que amplifica su impacto al permutar. SHAP controla ese efecto.</w:t>
-      </w:r>
-    </w:p>
-    <w:p>
-      <w:pPr>
-        <w:spacing w:after="60"/>
-        <w:jc w:val="center"/>
-      </w:pPr>
-      <w:r>
-        <w:drawing>
-          <wp:inline distT="0" distB="0" distL="0" distR="0">
-            <wp:extent cx="5048250" cy="1885950"/>
             <wp:effectExtent t="0" r="0" b="0" l="0"/>
             <wp:docPr id="1" name="" descr="" title=""/>
             <wp:cNvGraphicFramePr>
@@ -959,7 +857,7 @@
                   <pic:spPr bwMode="auto">
                     <a:xfrm>
                       <a:off x="0" y="0"/>
-                      <a:ext cx="5048250" cy="1885950"/>
+                      <a:ext cx="2857500" cy="2428875"/>
                     </a:xfrm>
                     <a:prstGeom prst="rect">
                       <a:avLst/>
@@ -985,7 +883,47 @@
           <w:sz w:val="19"/>
           <w:szCs w:val="19"/>
         </w:rPr>
-        <w:t xml:space="preserve">Figura 2. SHAP intervencional (izq.) vs. importancia por permutación (der.).</w:t>
+        <w:t xml:space="preserve">Figura 1. Matriz de confusión en el conjunto de prueba.</w:t>
+      </w:r>
+    </w:p>
+    <w:p>
+      <w:pPr>
+        <w:pStyle w:val="Heading1"/>
+        <w:spacing w:after="120" w:before="200"/>
+      </w:pPr>
+      <w:r>
+        <w:rPr>
+          <w:rFonts w:ascii="Arial" w:cs="Arial" w:eastAsia="Arial" w:hAnsi="Arial"/>
+          <w:b/>
+          <w:bCs/>
+          <w:sz w:val="26"/>
+          <w:szCs w:val="26"/>
+        </w:rPr>
+        <w:t xml:space="preserve">Explicación del Modelo</w:t>
+      </w:r>
+    </w:p>
+    <w:p>
+      <w:pPr>
+        <w:spacing w:after="160"/>
+        <w:jc w:val="both"/>
+      </w:pPr>
+      <w:r>
+        <w:rPr>
+          <w:rFonts w:ascii="Arial" w:cs="Arial" w:eastAsia="Arial" w:hAnsi="Arial"/>
+          <w:b/>
+          <w:bCs/>
+          <w:sz w:val="22"/>
+          <w:szCs w:val="22"/>
+        </w:rPr>
+        <w:t xml:space="preserve">SHAP global. </w:t>
+      </w:r>
+      <w:r>
+        <w:rPr>
+          <w:rFonts w:ascii="Arial" w:cs="Arial" w:eastAsia="Arial" w:hAnsi="Arial"/>
+          <w:sz w:val="22"/>
+          <w:szCs w:val="22"/>
+        </w:rPr>
+        <w:t xml:space="preserve">SHAP intervencional (Lundberg y Lee, 2017) marginaliza sobre la distribución de cada variable, rompiendo correlaciones entre predictores. CONCEAL encabeza el ranking (media |SHAP| = 0.082), seguida de HEIGHT (0.051) y CEILING (0.035). La importancia por permutación coincide en las tres variables centrales; HEIGHT lidera en permutación porque correlaciona con varias variables del entorno (ver Diagnóstico de Proxies), lo que amplifica su impacto al permutar. SHAP controla ese efecto.</w:t>
       </w:r>
     </w:p>
     <w:p>
@@ -996,7 +934,7 @@
       <w:r>
         <w:drawing>
           <wp:inline distT="0" distB="0" distL="0" distR="0">
-            <wp:extent cx="3619500" cy="2314575"/>
+            <wp:extent cx="5048250" cy="1885950"/>
             <wp:effectExtent t="0" r="0" b="0" l="0"/>
             <wp:docPr id="1" name="" descr="" title=""/>
             <wp:cNvGraphicFramePr>
@@ -1021,7 +959,7 @@
                   <pic:spPr bwMode="auto">
                     <a:xfrm>
                       <a:off x="0" y="0"/>
-                      <a:ext cx="3619500" cy="2314575"/>
+                      <a:ext cx="5048250" cy="1885950"/>
                     </a:xfrm>
                     <a:prstGeom prst="rect">
                       <a:avLst/>
@@ -1047,31 +985,7 @@
           <w:sz w:val="19"/>
           <w:szCs w:val="19"/>
         </w:rPr>
-        <w:t xml:space="preserve">Figura 2b. Gráfico de resumen SHAP (beeswarm): añade dirección y dispersión del efecto por sitio, no solo su magnitud media.</w:t>
-      </w:r>
-    </w:p>
-    <w:p>
-      <w:pPr>
-        <w:spacing w:after="160"/>
-        <w:jc w:val="both"/>
-      </w:pPr>
-      <w:r>
-        <w:rPr>
-          <w:rFonts w:ascii="Arial" w:cs="Arial" w:eastAsia="Arial" w:hAnsi="Arial"/>
-          <w:b/>
-          <w:bCs/>
-          <w:sz w:val="22"/>
-          <w:szCs w:val="22"/>
-        </w:rPr>
-        <w:t xml:space="preserve">Explicación local — sitio 27. </w:t>
-      </w:r>
-      <w:r>
-        <w:rPr>
-          <w:rFonts w:ascii="Arial" w:cs="Arial" w:eastAsia="Arial" w:hAnsi="Arial"/>
-          <w:sz w:val="22"/>
-          <w:szCs w:val="22"/>
-        </w:rPr>
-        <w:t xml:space="preserve">CONCEAL = A, HEIGHT = 315 cm, CEILING = 21 cm. Clase real: presencia; P(presencia) = 0.597 (base: 0.337). SHAP y LIME coinciden en CONCEAL = A como factor dominante. SHAP cumple la propiedad aditiva exactamente; LIME alcanza R² = 0.651.</w:t>
+        <w:t xml:space="preserve">Figura 2. SHAP intervencional (izq.) vs. importancia por permutación (der.).</w:t>
       </w:r>
     </w:p>
     <w:p>
@@ -1082,7 +996,7 @@
       <w:r>
         <w:drawing>
           <wp:inline distT="0" distB="0" distL="0" distR="0">
-            <wp:extent cx="5048250" cy="1752600"/>
+            <wp:extent cx="3619500" cy="2314575"/>
             <wp:effectExtent t="0" r="0" b="0" l="0"/>
             <wp:docPr id="1" name="" descr="" title=""/>
             <wp:cNvGraphicFramePr>
@@ -1107,7 +1021,7 @@
                   <pic:spPr bwMode="auto">
                     <a:xfrm>
                       <a:off x="0" y="0"/>
-                      <a:ext cx="5048250" cy="1752600"/>
+                      <a:ext cx="3619500" cy="2314575"/>
                     </a:xfrm>
                     <a:prstGeom prst="rect">
                       <a:avLst/>
@@ -1133,7 +1047,7 @@
           <w:sz w:val="19"/>
           <w:szCs w:val="19"/>
         </w:rPr>
-        <w:t xml:space="preserve">Figura 3. SHAP local (izq.) vs. LIME local (der.) para el sitio 27.</w:t>
+        <w:t xml:space="preserve">Figura 2b. Gráfico de resumen SHAP (beeswarm): añade dirección y dispersión del efecto por sitio, no solo su magnitud media.</w:t>
       </w:r>
     </w:p>
     <w:p>
@@ -1149,15 +1063,15 @@
           <w:sz w:val="22"/>
           <w:szCs w:val="22"/>
         </w:rPr>
-        <w:t xml:space="preserve">PDP, ICE y ALE. </w:t>
-      </w:r>
-      <w:r>
-        <w:rPr>
-          <w:rFonts w:ascii="Arial" w:cs="Arial" w:eastAsia="Arial" w:hAnsi="Arial"/>
-          <w:sz w:val="22"/>
-          <w:szCs w:val="22"/>
-        </w:rPr>
-        <w:t xml:space="preserve">PDP de CONCEAL: A → 0.418; B → 0.306; C → 0.243. Mayor ocultamiento se asocia con mayor P(presencia), coherente con la preferencia de la especie por sitios protegidos. Las curvas ICE de HEIGHT evidencian heterogeneidad entre sitios. Dado que HEIGHT correlaciona con CEILING, H_CEILING, BUILD_DIST y NEST_DIST (ver más abajo), se calculó además un gráfico ALE para HEIGHT: conserva la forma creciente del PDP, lo que indica que esa dependencia entre predictores no distorsiona de forma importante la relación marginal estimada.</w:t>
+        <w:t xml:space="preserve">Explicación local — sitio 27. </w:t>
+      </w:r>
+      <w:r>
+        <w:rPr>
+          <w:rFonts w:ascii="Arial" w:cs="Arial" w:eastAsia="Arial" w:hAnsi="Arial"/>
+          <w:sz w:val="22"/>
+          <w:szCs w:val="22"/>
+        </w:rPr>
+        <w:t xml:space="preserve">CONCEAL = A, HEIGHT = 315 cm, CEILING = 21 cm. Clase real: presencia; P(presencia) = 0.597 (base: 0.337). SHAP y LIME coinciden en CONCEAL = A como factor dominante. SHAP cumple la propiedad aditiva exactamente; LIME alcanza R² = 0.651.</w:t>
       </w:r>
     </w:p>
     <w:p>
@@ -1168,7 +1082,7 @@
       <w:r>
         <w:drawing>
           <wp:inline distT="0" distB="0" distL="0" distR="0">
-            <wp:extent cx="2667000" cy="2133600"/>
+            <wp:extent cx="5048250" cy="1752600"/>
             <wp:effectExtent t="0" r="0" b="0" l="0"/>
             <wp:docPr id="1" name="" descr="" title=""/>
             <wp:cNvGraphicFramePr>
@@ -1193,7 +1107,7 @@
                   <pic:spPr bwMode="auto">
                     <a:xfrm>
                       <a:off x="0" y="0"/>
-                      <a:ext cx="2667000" cy="2133600"/>
+                      <a:ext cx="5048250" cy="1752600"/>
                     </a:xfrm>
                     <a:prstGeom prst="rect">
                       <a:avLst/>
@@ -1219,7 +1133,31 @@
           <w:sz w:val="19"/>
           <w:szCs w:val="19"/>
         </w:rPr>
-        <w:t xml:space="preserve">Figura 4. PDP de CONCEAL: probabilidad promedio por categoría.</w:t>
+        <w:t xml:space="preserve">Figura 3. SHAP local (izq.) vs. LIME local (der.) para el sitio 27.</w:t>
+      </w:r>
+    </w:p>
+    <w:p>
+      <w:pPr>
+        <w:spacing w:after="160"/>
+        <w:jc w:val="both"/>
+      </w:pPr>
+      <w:r>
+        <w:rPr>
+          <w:rFonts w:ascii="Arial" w:cs="Arial" w:eastAsia="Arial" w:hAnsi="Arial"/>
+          <w:b/>
+          <w:bCs/>
+          <w:sz w:val="22"/>
+          <w:szCs w:val="22"/>
+        </w:rPr>
+        <w:t xml:space="preserve">PDP, ICE y ALE. </w:t>
+      </w:r>
+      <w:r>
+        <w:rPr>
+          <w:rFonts w:ascii="Arial" w:cs="Arial" w:eastAsia="Arial" w:hAnsi="Arial"/>
+          <w:sz w:val="22"/>
+          <w:szCs w:val="22"/>
+        </w:rPr>
+        <w:t xml:space="preserve">PDP de CONCEAL: A → 0.418; B → 0.306; C → 0.243. Mayor ocultamiento se asocia con mayor P(presencia), coherente con la preferencia de la especie por sitios protegidos. Las curvas ICE de HEIGHT evidencian heterogeneidad entre sitios. Dado que HEIGHT correlaciona con CEILING, H_CEILING, BUILD_DIST y NEST_DIST (ver más abajo), se calculó además un gráfico ALE para HEIGHT: conserva la forma creciente del PDP, lo que indica que esa dependencia entre predictores no distorsiona de forma importante la relación marginal estimada.</w:t>
       </w:r>
     </w:p>
     <w:p>
@@ -1230,7 +1168,7 @@
       <w:r>
         <w:drawing>
           <wp:inline distT="0" distB="0" distL="0" distR="0">
-            <wp:extent cx="3619500" cy="2247900"/>
+            <wp:extent cx="2667000" cy="2133600"/>
             <wp:effectExtent t="0" r="0" b="0" l="0"/>
             <wp:docPr id="1" name="" descr="" title=""/>
             <wp:cNvGraphicFramePr>
@@ -1255,7 +1193,7 @@
                   <pic:spPr bwMode="auto">
                     <a:xfrm>
                       <a:off x="0" y="0"/>
-                      <a:ext cx="3619500" cy="2247900"/>
+                      <a:ext cx="2667000" cy="2133600"/>
                     </a:xfrm>
                     <a:prstGeom prst="rect">
                       <a:avLst/>
@@ -1281,7 +1219,7 @@
           <w:sz w:val="19"/>
           <w:szCs w:val="19"/>
         </w:rPr>
-        <w:t xml:space="preserve">Figura 5. PDP e ICE — HEIGHT.</w:t>
+        <w:t xml:space="preserve">Figura 4. PDP de CONCEAL: probabilidad promedio por categoría.</w:t>
       </w:r>
     </w:p>
     <w:p>
@@ -1343,37 +1281,7 @@
           <w:sz w:val="19"/>
           <w:szCs w:val="19"/>
         </w:rPr>
-        <w:t xml:space="preserve">Figura 5b. ALE — HEIGHT.</w:t>
-      </w:r>
-    </w:p>
-    <w:p>
-      <w:pPr>
-        <w:pStyle w:val="Heading1"/>
-        <w:spacing w:after="120" w:before="200"/>
-      </w:pPr>
-      <w:r>
-        <w:rPr>
-          <w:rFonts w:ascii="Arial" w:cs="Arial" w:eastAsia="Arial" w:hAnsi="Arial"/>
-          <w:b/>
-          <w:bCs/>
-          <w:sz w:val="26"/>
-          <w:szCs w:val="26"/>
-        </w:rPr>
-        <w:t xml:space="preserve">Diagnóstico de Proxies</w:t>
-      </w:r>
-    </w:p>
-    <w:p>
-      <w:pPr>
-        <w:spacing w:after="160"/>
-        <w:jc w:val="both"/>
-      </w:pPr>
-      <w:r>
-        <w:rPr>
-          <w:rFonts w:ascii="Arial" w:cs="Arial" w:eastAsia="Arial" w:hAnsi="Arial"/>
-          <w:sz w:val="22"/>
-          <w:szCs w:val="22"/>
-        </w:rPr>
-        <w:t xml:space="preserve">El análisis de correlaciones entre variables numéricas marca cinco pares con |r| &gt; 0.15 —no uno solo, como se reportó en una versión previa de este informe—: HEIGHT↔CEILING (r = −0.21), HEIGHT↔H_CEILING (r = 0.21), HEIGHT↔BUILD_DIST (r = −0.16), HEIGHT↔NEST_DIST (r = 0.32) y TREE_DIST↔BUILD_DIST (r = 0.21).</w:t>
+        <w:t xml:space="preserve">Figura 5. PDP e ICE — HEIGHT.</w:t>
       </w:r>
     </w:p>
     <w:p>
@@ -1384,7 +1292,7 @@
       <w:r>
         <w:drawing>
           <wp:inline distT="0" distB="0" distL="0" distR="0">
-            <wp:extent cx="3810000" cy="2943225"/>
+            <wp:extent cx="3619500" cy="2247900"/>
             <wp:effectExtent t="0" r="0" b="0" l="0"/>
             <wp:docPr id="1" name="" descr="" title=""/>
             <wp:cNvGraphicFramePr>
@@ -1409,7 +1317,7 @@
                   <pic:spPr bwMode="auto">
                     <a:xfrm>
                       <a:off x="0" y="0"/>
-                      <a:ext cx="3810000" cy="2943225"/>
+                      <a:ext cx="3619500" cy="2247900"/>
                     </a:xfrm>
                     <a:prstGeom prst="rect">
                       <a:avLst/>
@@ -1435,21 +1343,7 @@
           <w:sz w:val="19"/>
           <w:szCs w:val="19"/>
         </w:rPr>
-        <w:t xml:space="preserve">Figura 6. Mapa de correlaciones. Cinco pares superan |r| &gt; 0.15.</w:t>
-      </w:r>
-    </w:p>
-    <w:p>
-      <w:pPr>
-        <w:spacing w:after="160"/>
-        <w:jc w:val="both"/>
-      </w:pPr>
-      <w:r>
-        <w:rPr>
-          <w:rFonts w:ascii="Arial" w:cs="Arial" w:eastAsia="Arial" w:hAnsi="Arial"/>
-          <w:sz w:val="22"/>
-          <w:szCs w:val="22"/>
-        </w:rPr>
-        <w:t xml:space="preserve">HEIGHT concentra casi todas las correlaciones relevantes: puede ser proxy del tipo de edificio (comercial/institucional, con partes altas menos perturbadas por personas), lo que a su vez condiciona CEILING, H_CEILING y la distancia a otros nidos (NEST_DIST). El par TREE_DIST↔BUILD_DIST (r = 0.21) juega, en este conjunto, el papel que la guía ejemplifica con TREE_DIST y GREEN_DIST: describe qué tan denso o abierto es el entorno inmediato del sitio. Se comprobó explícitamente el ejemplo propuesto por la guía: TREE_DIST↔GREEN_DIST solo alcanza r = 0.075 en estos datos, es decir, esas dos variables en particular no comparten información relevante aquí, aunque conceptualmente podrían hacerlo. El SHAP intervencional rompe correlaciones entre variables observadas, pero no elimina la confusión con variables ausentes del dataset (alimento, depredación, perturbación histórica). La atribución SHAP mide cuánto usa el modelo cada variable, no su efecto causal.</w:t>
+        <w:t xml:space="preserve">Figura 5b. ALE — HEIGHT.</w:t>
       </w:r>
     </w:p>
     <w:p>
@@ -1465,7 +1359,7 @@
           <w:sz w:val="26"/>
           <w:szCs w:val="26"/>
         </w:rPr>
-        <w:t xml:space="preserve">Pregunta Causal</w:t>
+        <w:t xml:space="preserve">Diagnóstico de Proxies</w:t>
       </w:r>
     </w:p>
     <w:p>
@@ -1479,61 +1373,7 @@
           <w:sz w:val="22"/>
           <w:szCs w:val="22"/>
         </w:rPr>
-        <w:t xml:space="preserve">SHAP y LIME responden a «¿qué características usa el modelo para predecir?». La pregunta que no pueden responder es:</w:t>
-      </w:r>
-    </w:p>
-    <w:p>
-      <w:pPr>
-        <w:spacing w:after="160"/>
-        <w:jc w:val="both"/>
-      </w:pPr>
-      <w:r>
-        <w:rPr>
-          <w:rFonts w:ascii="Arial" w:cs="Arial" w:eastAsia="Arial" w:hAnsi="Arial"/>
-          <w:i/>
-          <w:iCs/>
-          <w:sz w:val="22"/>
-          <w:szCs w:val="22"/>
-        </w:rPr>
-        <w:t xml:space="preserve">¿Qué ocurriría con la probabilidad de anidación si se modificara activamente CONCEAL, manteniendo las demás condiciones iguales?</w:t>
-      </w:r>
-    </w:p>
-    <w:p>
-      <w:pPr>
-        <w:spacing w:after="160"/>
-        <w:jc w:val="both"/>
-      </w:pPr>
-      <w:r>
-        <w:rPr>
-          <w:rFonts w:ascii="Arial" w:cs="Arial" w:eastAsia="Arial" w:hAnsi="Arial"/>
-          <w:sz w:val="22"/>
-          <w:szCs w:val="22"/>
-        </w:rPr>
-        <w:t xml:space="preserve">Esta es una pregunta de intervención (Pearl, 2009): do(CONCEAL = A) ≠ P(nido | CONCEAL = A). Los sitios con CONCEAL = A llegaron con todas las condiciones que los hacen elegibles; una intervención rompe ese mecanismo. Para responderla se necesita: (a) experimento controlado aleatorizado, (b) DAG especificado con conocimiento ecológico, o (c) ajuste por confusión. Más datos observacionales no resuelven el problema.</w:t>
-      </w:r>
-    </w:p>
-    <w:p>
-      <w:pPr>
-        <w:spacing w:after="160"/>
-        <w:jc w:val="both"/>
-      </w:pPr>
-      <w:r>
-        <w:rPr>
-          <w:rFonts w:ascii="Arial" w:cs="Arial" w:eastAsia="Arial" w:hAnsi="Arial"/>
-          <w:b/>
-          <w:bCs/>
-          <w:sz w:val="22"/>
-          <w:szCs w:val="22"/>
-        </w:rPr>
-        <w:t xml:space="preserve">Limitaciones. </w:t>
-      </w:r>
-      <w:r>
-        <w:rPr>
-          <w:rFonts w:ascii="Arial" w:cs="Arial" w:eastAsia="Arial" w:hAnsi="Arial"/>
-          <w:sz w:val="22"/>
-          <w:szCs w:val="22"/>
-        </w:rPr>
-        <w:t xml:space="preserve">(1) Diseño observacional: sesgo de selección. (2) Muestra pequeña (n+ = 32): alta varianza. (3) Dependencia espacial. (4) Variables no observadas: alimento, depredación, perturbación histórica.</w:t>
+        <w:t xml:space="preserve">El análisis de correlaciones entre variables numéricas marca cinco pares con |r| &gt; 0.15 —no uno solo, como se reportó en una versión previa de este informe—: HEIGHT↔CEILING (r = −0.21), HEIGHT↔H_CEILING (r = 0.21), HEIGHT↔BUILD_DIST (r = −0.16), HEIGHT↔NEST_DIST (r = 0.32) y TREE_DIST↔BUILD_DIST (r = 0.21).</w:t>
       </w:r>
     </w:p>
     <w:p>
@@ -1544,7 +1384,7 @@
       <w:r>
         <w:drawing>
           <wp:inline distT="0" distB="0" distL="0" distR="0">
-            <wp:extent cx="4381500" cy="2628900"/>
+            <wp:extent cx="3810000" cy="2943225"/>
             <wp:effectExtent t="0" r="0" b="0" l="0"/>
             <wp:docPr id="1" name="" descr="" title=""/>
             <wp:cNvGraphicFramePr>
@@ -1569,6 +1409,166 @@
                   <pic:spPr bwMode="auto">
                     <a:xfrm>
                       <a:off x="0" y="0"/>
+                      <a:ext cx="3810000" cy="2943225"/>
+                    </a:xfrm>
+                    <a:prstGeom prst="rect">
+                      <a:avLst/>
+                    </a:prstGeom>
+                  </pic:spPr>
+                </pic:pic>
+              </a:graphicData>
+            </a:graphic>
+          </wp:inline>
+        </w:drawing>
+      </w:r>
+    </w:p>
+    <w:p>
+      <w:pPr>
+        <w:spacing w:after="200"/>
+        <w:jc w:val="center"/>
+      </w:pPr>
+      <w:r>
+        <w:rPr>
+          <w:rFonts w:ascii="Arial" w:cs="Arial" w:eastAsia="Arial" w:hAnsi="Arial"/>
+          <w:i/>
+          <w:iCs/>
+          <w:sz w:val="19"/>
+          <w:szCs w:val="19"/>
+        </w:rPr>
+        <w:t xml:space="preserve">Figura 6. Mapa de correlaciones. Cinco pares superan |r| &gt; 0.15.</w:t>
+      </w:r>
+    </w:p>
+    <w:p>
+      <w:pPr>
+        <w:spacing w:after="160"/>
+        <w:jc w:val="both"/>
+      </w:pPr>
+      <w:r>
+        <w:rPr>
+          <w:rFonts w:ascii="Arial" w:cs="Arial" w:eastAsia="Arial" w:hAnsi="Arial"/>
+          <w:sz w:val="22"/>
+          <w:szCs w:val="22"/>
+        </w:rPr>
+        <w:t xml:space="preserve">HEIGHT concentra casi todas las correlaciones relevantes: puede ser proxy del tipo de edificio (comercial/institucional, con partes altas menos perturbadas por personas), lo que a su vez condiciona CEILING, H_CEILING y la distancia a otros nidos (NEST_DIST). El par TREE_DIST↔BUILD_DIST (r = 0.21) juega, en este conjunto, el papel que la guía ejemplifica con TREE_DIST y GREEN_DIST: describe qué tan denso o abierto es el entorno inmediato del sitio. Se comprobó explícitamente el ejemplo propuesto por la guía: TREE_DIST↔GREEN_DIST solo alcanza r = 0.075 en estos datos, es decir, esas dos variables en particular no comparten información relevante aquí, aunque conceptualmente podrían hacerlo. El SHAP intervencional rompe correlaciones entre variables observadas, pero no elimina la confusión con variables ausentes del dataset (alimento, depredación, perturbación histórica). La atribución SHAP mide cuánto usa el modelo cada variable, no su efecto causal.</w:t>
+      </w:r>
+    </w:p>
+    <w:p>
+      <w:pPr>
+        <w:pStyle w:val="Heading1"/>
+        <w:spacing w:after="120" w:before="200"/>
+      </w:pPr>
+      <w:r>
+        <w:rPr>
+          <w:rFonts w:ascii="Arial" w:cs="Arial" w:eastAsia="Arial" w:hAnsi="Arial"/>
+          <w:b/>
+          <w:bCs/>
+          <w:sz w:val="26"/>
+          <w:szCs w:val="26"/>
+        </w:rPr>
+        <w:t xml:space="preserve">Pregunta Causal</w:t>
+      </w:r>
+    </w:p>
+    <w:p>
+      <w:pPr>
+        <w:spacing w:after="160"/>
+        <w:jc w:val="both"/>
+      </w:pPr>
+      <w:r>
+        <w:rPr>
+          <w:rFonts w:ascii="Arial" w:cs="Arial" w:eastAsia="Arial" w:hAnsi="Arial"/>
+          <w:sz w:val="22"/>
+          <w:szCs w:val="22"/>
+        </w:rPr>
+        <w:t xml:space="preserve">SHAP y LIME responden a «¿qué características usa el modelo para predecir?». La pregunta que no pueden responder es:</w:t>
+      </w:r>
+    </w:p>
+    <w:p>
+      <w:pPr>
+        <w:spacing w:after="160"/>
+        <w:jc w:val="both"/>
+      </w:pPr>
+      <w:r>
+        <w:rPr>
+          <w:rFonts w:ascii="Arial" w:cs="Arial" w:eastAsia="Arial" w:hAnsi="Arial"/>
+          <w:i/>
+          <w:iCs/>
+          <w:sz w:val="22"/>
+          <w:szCs w:val="22"/>
+        </w:rPr>
+        <w:t xml:space="preserve">¿Qué ocurriría con la probabilidad de anidación si se modificara activamente CONCEAL, manteniendo las demás condiciones iguales?</w:t>
+      </w:r>
+    </w:p>
+    <w:p>
+      <w:pPr>
+        <w:spacing w:after="160"/>
+        <w:jc w:val="both"/>
+      </w:pPr>
+      <w:r>
+        <w:rPr>
+          <w:rFonts w:ascii="Arial" w:cs="Arial" w:eastAsia="Arial" w:hAnsi="Arial"/>
+          <w:sz w:val="22"/>
+          <w:szCs w:val="22"/>
+        </w:rPr>
+        <w:t xml:space="preserve">Esta es una pregunta de intervención (Pearl, 2009): do(CONCEAL = A) ≠ P(nido | CONCEAL = A). Los sitios con CONCEAL = A llegaron con todas las condiciones que los hacen elegibles; una intervención rompe ese mecanismo. Para responderla se necesita: (a) experimento controlado aleatorizado, (b) DAG especificado con conocimiento ecológico, o (c) ajuste por confusión. Más datos observacionales no resuelven el problema.</w:t>
+      </w:r>
+    </w:p>
+    <w:p>
+      <w:pPr>
+        <w:spacing w:after="160"/>
+        <w:jc w:val="both"/>
+      </w:pPr>
+      <w:r>
+        <w:rPr>
+          <w:rFonts w:ascii="Arial" w:cs="Arial" w:eastAsia="Arial" w:hAnsi="Arial"/>
+          <w:b/>
+          <w:bCs/>
+          <w:sz w:val="22"/>
+          <w:szCs w:val="22"/>
+        </w:rPr>
+        <w:t xml:space="preserve">Limitaciones. </w:t>
+      </w:r>
+      <w:r>
+        <w:rPr>
+          <w:rFonts w:ascii="Arial" w:cs="Arial" w:eastAsia="Arial" w:hAnsi="Arial"/>
+          <w:sz w:val="22"/>
+          <w:szCs w:val="22"/>
+        </w:rPr>
+        <w:t xml:space="preserve">(1) Diseño observacional: sesgo de selección. (2) Muestra pequeña (n+ = 32): alta varianza. (3) Dependencia espacial. (4) Variables no observadas: alimento, depredación, perturbación histórica.</w:t>
+      </w:r>
+    </w:p>
+    <w:p>
+      <w:pPr>
+        <w:spacing w:after="60"/>
+        <w:jc w:val="center"/>
+      </w:pPr>
+      <w:r>
+        <w:drawing>
+          <wp:inline distT="0" distB="0" distL="0" distR="0">
+            <wp:extent cx="4381500" cy="2628900"/>
+            <wp:effectExtent t="0" r="0" b="0" l="0"/>
+            <wp:docPr id="1" name="" descr="" title=""/>
+            <wp:cNvGraphicFramePr>
+              <a:graphicFrameLocks xmlns:a="http://schemas.openxmlformats.org/drawingml/2006/main" noChangeAspect="1"/>
+            </wp:cNvGraphicFramePr>
+            <a:graphic xmlns:a="http://schemas.openxmlformats.org/drawingml/2006/main">
+              <a:graphicData uri="http://schemas.openxmlformats.org/drawingml/2006/picture">
+                <pic:pic xmlns:pic="http://schemas.openxmlformats.org/drawingml/2006/picture">
+                  <pic:nvPicPr>
+                    <pic:cNvPr id="0" name="" descr=""/>
+                    <pic:cNvPicPr>
+                      <a:picLocks noChangeAspect="1" noChangeArrowheads="1"/>
+                    </pic:cNvPicPr>
+                  </pic:nvPicPr>
+                  <pic:blipFill>
+                    <a:blip r:embed="rId16" cstate="none"/>
+                    <a:srcRect/>
+                    <a:stretch>
+                      <a:fillRect/>
+                    </a:stretch>
+                  </pic:blipFill>
+                  <pic:spPr bwMode="auto">
+                    <a:xfrm>
+                      <a:off x="0" y="0"/>
                       <a:ext cx="4381500" cy="2628900"/>
                     </a:xfrm>
                     <a:prstGeom prst="rect">
@@ -1647,6 +1647,7 @@
     <w:p>
       <w:pPr>
         <w:spacing w:after="160"/>
+        <w:ind w:left="720" w:hanging="720"/>
         <w:jc w:val="left"/>
       </w:pPr>
       <w:r>
@@ -1661,6 +1662,7 @@
     <w:p>
       <w:pPr>
         <w:spacing w:after="160"/>
+        <w:ind w:left="720" w:hanging="720"/>
         <w:jc w:val="left"/>
       </w:pPr>
       <w:r>
@@ -1675,6 +1677,7 @@
     <w:p>
       <w:pPr>
         <w:spacing w:after="160"/>
+        <w:ind w:left="720" w:hanging="720"/>
         <w:jc w:val="left"/>
       </w:pPr>
       <w:r>
@@ -1689,6 +1692,7 @@
     <w:p>
       <w:pPr>
         <w:spacing w:after="160"/>
+        <w:ind w:left="720" w:hanging="720"/>
         <w:jc w:val="left"/>
       </w:pPr>
       <w:r>
@@ -1703,6 +1707,7 @@
     <w:p>
       <w:pPr>
         <w:spacing w:after="160"/>
+        <w:ind w:left="720" w:hanging="720"/>
         <w:jc w:val="left"/>
       </w:pPr>
       <w:r>
@@ -1717,6 +1722,7 @@
     <w:p>
       <w:pPr>
         <w:spacing w:after="160"/>
+        <w:ind w:left="720" w:hanging="720"/>
         <w:jc w:val="left"/>
       </w:pPr>
       <w:r>
@@ -1729,6 +1735,7 @@
       </w:r>
     </w:p>
     <w:sectPr>
+      <w:headerReference w:type="default" r:id="rId7"/>
       <w:pgSz w:w="11906" w:h="16838" w:orient="portrait"/>
       <w:pgMar w:top="1020" w:right="1134" w:bottom="1020" w:left="1134" w:header="708" w:footer="708" w:gutter="0"/>
       <w:pgNumType/>
@@ -1814,6 +1821,27 @@
     </w:p>
   </w:footnote>
 </w:footnotes>
+</file>
+
+<file path=word/header1.xml><?xml version="1.0" encoding="utf-8"?>
+<w:hdr xmlns:wpc="http://schemas.microsoft.com/office/word/2010/wordprocessingCanvas" xmlns:mc="http://schemas.openxmlformats.org/markup-compatibility/2006" xmlns:o="urn:schemas-microsoft-com:office:office" xmlns:r="http://schemas.openxmlformats.org/officeDocument/2006/relationships" xmlns:m="http://schemas.openxmlformats.org/officeDocument/2006/math" xmlns:v="urn:schemas-microsoft-com:vml" xmlns:wp14="http://schemas.microsoft.com/office/word/2010/wordprocessingDrawing" xmlns:wp="http://schemas.openxmlformats.org/drawingml/2006/wordprocessingDrawing" xmlns:w10="urn:schemas-microsoft-com:office:word" xmlns:w="http://schemas.openxmlformats.org/wordprocessingml/2006/main" xmlns:w14="http://schemas.microsoft.com/office/word/2010/wordml" xmlns:w15="http://schemas.microsoft.com/office/word/2012/wordml" xmlns:wpg="http://schemas.microsoft.com/office/word/2010/wordprocessingGroup" xmlns:wpi="http://schemas.microsoft.com/office/word/2010/wordprocessingInk" xmlns:wne="http://schemas.microsoft.com/office/word/2006/wordml" xmlns:wps="http://schemas.microsoft.com/office/word/2010/wordprocessingShape" xmlns:cx="http://schemas.microsoft.com/office/drawing/2014/chartex" xmlns:cx1="http://schemas.microsoft.com/office/drawing/2015/9/8/chartex" xmlns:cx2="http://schemas.microsoft.com/office/drawing/2015/10/21/chartex" xmlns:cx3="http://schemas.microsoft.com/office/drawing/2016/5/9/chartex" xmlns:cx4="http://schemas.microsoft.com/office/drawing/2016/5/10/chartex" xmlns:cx5="http://schemas.microsoft.com/office/drawing/2016/5/11/chartex" xmlns:cx6="http://schemas.microsoft.com/office/drawing/2016/5/12/chartex" xmlns:cx7="http://schemas.microsoft.com/office/drawing/2016/5/13/chartex" xmlns:cx8="http://schemas.microsoft.com/office/drawing/2016/5/14/chartex" xmlns:w16cid="http://schemas.microsoft.com/office/word/2016/wordml/cid" xmlns:w16se="http://schemas.microsoft.com/office/word/2015/wordml/symex">
+  <w:p>
+    <w:pPr>
+      <w:jc w:val="right"/>
+    </w:pPr>
+    <w:r>
+      <w:rPr>
+        <w:rFonts w:ascii="Arial" w:cs="Arial" w:eastAsia="Arial" w:hAnsi="Arial"/>
+        <w:sz w:val="20"/>
+        <w:szCs w:val="20"/>
+      </w:rPr>
+      <w:fldChar w:fldCharType="begin"/>
+      <w:instrText xml:space="preserve">PAGE</w:instrText>
+      <w:fldChar w:fldCharType="separate"/>
+      <w:fldChar w:fldCharType="end"/>
+    </w:r>
+  </w:p>
+</w:hdr>
 </file>
 
 <file path=word/numbering.xml><?xml version="1.0" encoding="utf-8"?>

</xml_diff>